<commit_message>
DOCS : Modifs exercice de correction d'algo
</commit_message>
<xml_diff>
--- a/Boucles/Exercices Boucles.docx
+++ b/Boucles/Exercices Boucles.docx
@@ -180,7 +180,10 @@
         </w:numPr>
       </w:pPr>
       <w:r>
-        <w:t>Si i &gt;= 3</w:t>
+        <w:t>Si i</w:t>
+      </w:r>
+      <w:r>
+        <w:t xml:space="preserve"> &gt;= 4</w:t>
       </w:r>
     </w:p>
     <w:p>
@@ -258,7 +261,10 @@
         </w:numPr>
       </w:pPr>
       <w:r>
-        <w:t>POUR i de 1 à 10, AFFICHER Nombre :</w:t>
+        <w:t xml:space="preserve">POUR Compteur de 1 à 10 </w:t>
+      </w:r>
+      <w:r>
+        <w:t>:</w:t>
       </w:r>
     </w:p>
     <w:p>
@@ -269,13 +275,22 @@
           <w:numId w:val="4"/>
         </w:numPr>
       </w:pPr>
-      <w:proofErr w:type="gramStart"/>
-      <w:r>
-        <w:t>i</w:t>
-      </w:r>
-      <w:proofErr w:type="gramEnd"/>
-      <w:r>
-        <w:t xml:space="preserve"> = i x Nombre</w:t>
+      <w:proofErr w:type="spellStart"/>
+      <w:r>
+        <w:t>Resultat</w:t>
+      </w:r>
+      <w:proofErr w:type="spellEnd"/>
+      <w:r>
+        <w:t xml:space="preserve"> </w:t>
+      </w:r>
+      <w:r>
+        <w:t>&lt;</w:t>
+      </w:r>
+      <w:r>
+        <w:t>= Compteur *</w:t>
+      </w:r>
+      <w:r>
+        <w:t xml:space="preserve"> Nombre</w:t>
       </w:r>
     </w:p>
     <w:p>
@@ -287,8 +302,13 @@
         </w:numPr>
       </w:pPr>
       <w:r>
-        <w:t>AFFICHER ‘Le nombre est à’ + Nombre</w:t>
-      </w:r>
+        <w:t xml:space="preserve">AFFICHER ‘Le nombre est à’ + </w:t>
+      </w:r>
+      <w:r>
+        <w:t>Resultat</w:t>
+      </w:r>
+      <w:bookmarkStart w:id="0" w:name="_GoBack"/>
+      <w:bookmarkEnd w:id="0"/>
     </w:p>
     <w:p>
       <w:pPr>
@@ -301,8 +321,6 @@
       <w:r>
         <w:t>FIN POUR</w:t>
       </w:r>
-      <w:bookmarkStart w:id="0" w:name="_GoBack"/>
-      <w:bookmarkEnd w:id="0"/>
     </w:p>
     <w:sectPr>
       <w:pgSz w:w="11906" w:h="16838"/>

</xml_diff>